<commit_message>
v1.1.1: [doc] highlight completed exercises
</commit_message>
<xml_diff>
--- a/BV-RVC_exercises/Requirement/AdvanceCSharp.docx
+++ b/BV-RVC_exercises/Requirement/AdvanceCSharp.docx
@@ -1,6 +1,6 @@
 
 <file path=word/document.xml><?xml version="1.0" encoding="utf-8"?>
-<w:document xmlns:wpc="http://schemas.microsoft.com/office/word/2010/wordprocessingCanvas" xmlns:cx="http://schemas.microsoft.com/office/drawing/2014/chartex" xmlns:mc="http://schemas.openxmlformats.org/markup-compatibility/2006" xmlns:o="urn:schemas-microsoft-com:office:office" xmlns:r="http://schemas.openxmlformats.org/officeDocument/2006/relationships" xmlns:m="http://schemas.openxmlformats.org/officeDocument/2006/math" xmlns:v="urn:schemas-microsoft-com:vml" xmlns:wp14="http://schemas.microsoft.com/office/word/2010/wordprocessingDrawing" xmlns:wp="http://schemas.openxmlformats.org/drawingml/2006/wordprocessingDrawing" xmlns:w10="urn:schemas-microsoft-com:office:word" xmlns:w="http://schemas.openxmlformats.org/wordprocessingml/2006/main" xmlns:w14="http://schemas.microsoft.com/office/word/2010/wordml" xmlns:w15="http://schemas.microsoft.com/office/word/2012/wordml" xmlns:w16se="http://schemas.microsoft.com/office/word/2015/wordml/symex" xmlns:wpg="http://schemas.microsoft.com/office/word/2010/wordprocessingGroup" xmlns:wpi="http://schemas.microsoft.com/office/word/2010/wordprocessingInk" xmlns:wne="http://schemas.microsoft.com/office/word/2006/wordml" xmlns:wps="http://schemas.microsoft.com/office/word/2010/wordprocessingShape" mc:Ignorable="w14 w15 w16se wp14">
+<w:document xmlns:wpc="http://schemas.microsoft.com/office/word/2010/wordprocessingCanvas" xmlns:cx="http://schemas.microsoft.com/office/drawing/2014/chartex" xmlns:cx1="http://schemas.microsoft.com/office/drawing/2015/9/8/chartex" xmlns:cx2="http://schemas.microsoft.com/office/drawing/2015/10/21/chartex" xmlns:cx3="http://schemas.microsoft.com/office/drawing/2016/5/9/chartex" xmlns:cx4="http://schemas.microsoft.com/office/drawing/2016/5/10/chartex" xmlns:cx5="http://schemas.microsoft.com/office/drawing/2016/5/11/chartex" xmlns:cx6="http://schemas.microsoft.com/office/drawing/2016/5/12/chartex" xmlns:cx7="http://schemas.microsoft.com/office/drawing/2016/5/13/chartex" xmlns:cx8="http://schemas.microsoft.com/office/drawing/2016/5/14/chartex" xmlns:mc="http://schemas.openxmlformats.org/markup-compatibility/2006" xmlns:aink="http://schemas.microsoft.com/office/drawing/2016/ink" xmlns:am3d="http://schemas.microsoft.com/office/drawing/2017/model3d" xmlns:o="urn:schemas-microsoft-com:office:office" xmlns:oel="http://schemas.microsoft.com/office/2019/extlst" xmlns:r="http://schemas.openxmlformats.org/officeDocument/2006/relationships" xmlns:m="http://schemas.openxmlformats.org/officeDocument/2006/math" xmlns:v="urn:schemas-microsoft-com:vml" xmlns:wp14="http://schemas.microsoft.com/office/word/2010/wordprocessingDrawing" xmlns:wp="http://schemas.openxmlformats.org/drawingml/2006/wordprocessingDrawing" xmlns:w10="urn:schemas-microsoft-com:office:word" xmlns:w="http://schemas.openxmlformats.org/wordprocessingml/2006/main" xmlns:w14="http://schemas.microsoft.com/office/word/2010/wordml" xmlns:w15="http://schemas.microsoft.com/office/word/2012/wordml" xmlns:w16cex="http://schemas.microsoft.com/office/word/2018/wordml/cex" xmlns:w16cid="http://schemas.microsoft.com/office/word/2016/wordml/cid" xmlns:w16="http://schemas.microsoft.com/office/word/2018/wordml" xmlns:w16du="http://schemas.microsoft.com/office/word/2023/wordml/word16du" xmlns:w16sdtdh="http://schemas.microsoft.com/office/word/2020/wordml/sdtdatahash" xmlns:w16sdtfl="http://schemas.microsoft.com/office/word/2024/wordml/sdtformatlock" xmlns:w16se="http://schemas.microsoft.com/office/word/2015/wordml/symex" xmlns:wpg="http://schemas.microsoft.com/office/word/2010/wordprocessingGroup" xmlns:wpi="http://schemas.microsoft.com/office/word/2010/wordprocessingInk" xmlns:wne="http://schemas.microsoft.com/office/word/2006/wordml" xmlns:wps="http://schemas.microsoft.com/office/word/2010/wordprocessingShape" mc:Ignorable="w14 w15 w16se w16cid w16 w16cex w16sdtdh w16sdtfl w16du wp14">
   <w:body>
     <w:p>
       <w:pPr>
@@ -12,7 +12,7 @@
         <w:rPr>
           <w:rStyle w:val="fontstyle01"/>
           <w:rFonts w:ascii="Arial" w:hAnsi="Arial" w:cs="Arial"/>
-          <w:color w:val="auto"/>
+          <w:color w:val="70AD47" w:themeColor="accent6"/>
           <w:sz w:val="22"/>
           <w:szCs w:val="22"/>
         </w:rPr>
@@ -21,6 +21,7 @@
         <w:rPr>
           <w:rStyle w:val="fontstyle01"/>
           <w:rFonts w:ascii="Arial" w:hAnsi="Arial" w:cs="Arial"/>
+          <w:color w:val="70AD47" w:themeColor="accent6"/>
           <w:sz w:val="22"/>
           <w:szCs w:val="22"/>
         </w:rPr>
@@ -30,6 +31,7 @@
         <w:rPr>
           <w:rStyle w:val="fontstyle21"/>
           <w:rFonts w:ascii="Arial" w:hAnsi="Arial" w:cs="Arial"/>
+          <w:color w:val="70AD47" w:themeColor="accent6"/>
         </w:rPr>
         <w:t xml:space="preserve">Student </w:t>
       </w:r>
@@ -37,6 +39,7 @@
         <w:rPr>
           <w:rStyle w:val="fontstyle01"/>
           <w:rFonts w:ascii="Arial" w:hAnsi="Arial" w:cs="Arial"/>
+          <w:color w:val="70AD47" w:themeColor="accent6"/>
           <w:sz w:val="22"/>
           <w:szCs w:val="22"/>
         </w:rPr>
@@ -45,7 +48,7 @@
       <w:r>
         <w:rPr>
           <w:rFonts w:ascii="Arial" w:hAnsi="Arial" w:cs="Arial"/>
-          <w:color w:val="000000"/>
+          <w:color w:val="70AD47" w:themeColor="accent6"/>
         </w:rPr>
         <w:br/>
       </w:r>
@@ -53,6 +56,7 @@
         <w:rPr>
           <w:rStyle w:val="fontstyle01"/>
           <w:rFonts w:ascii="Arial" w:hAnsi="Arial" w:cs="Arial"/>
+          <w:color w:val="70AD47" w:themeColor="accent6"/>
           <w:sz w:val="22"/>
           <w:szCs w:val="22"/>
         </w:rPr>
@@ -61,7 +65,7 @@
       <w:r>
         <w:rPr>
           <w:rFonts w:ascii="Arial" w:hAnsi="Arial" w:cs="Arial"/>
-          <w:color w:val="000000"/>
+          <w:color w:val="70AD47" w:themeColor="accent6"/>
         </w:rPr>
         <w:br/>
       </w:r>
@@ -69,6 +73,7 @@
         <w:rPr>
           <w:rStyle w:val="fontstyle01"/>
           <w:rFonts w:ascii="Arial" w:hAnsi="Arial" w:cs="Arial"/>
+          <w:color w:val="70AD47" w:themeColor="accent6"/>
           <w:sz w:val="22"/>
           <w:szCs w:val="22"/>
         </w:rPr>
@@ -84,11 +89,13 @@
         </w:numPr>
         <w:rPr>
           <w:rFonts w:ascii="Arial" w:hAnsi="Arial" w:cs="Arial"/>
-        </w:rPr>
-      </w:pPr>
-      <w:r>
-        <w:rPr>
-          <w:rFonts w:ascii="Arial" w:hAnsi="Arial" w:cs="Arial"/>
+          <w:color w:val="70AD47" w:themeColor="accent6"/>
+        </w:rPr>
+      </w:pPr>
+      <w:r>
+        <w:rPr>
+          <w:rFonts w:ascii="Arial" w:hAnsi="Arial" w:cs="Arial"/>
+          <w:color w:val="70AD47" w:themeColor="accent6"/>
         </w:rPr>
         <w:t>Find Uppercase words in a String using C# LINQ</w:t>
       </w:r>
@@ -98,11 +105,13 @@
         <w:pStyle w:val="ListParagraph"/>
         <w:rPr>
           <w:rFonts w:ascii="Arial" w:hAnsi="Arial" w:cs="Arial"/>
-        </w:rPr>
-      </w:pPr>
-      <w:r>
-        <w:rPr>
-          <w:rFonts w:ascii="Arial" w:hAnsi="Arial" w:cs="Arial"/>
+          <w:color w:val="70AD47" w:themeColor="accent6"/>
+        </w:rPr>
+      </w:pPr>
+      <w:r>
+        <w:rPr>
+          <w:rFonts w:ascii="Arial" w:hAnsi="Arial" w:cs="Arial"/>
+          <w:color w:val="70AD47" w:themeColor="accent6"/>
         </w:rPr>
         <w:t>Ex.  string str = “THIS is A very STRANGE string”</w:t>
       </w:r>
@@ -112,11 +121,13 @@
         <w:pStyle w:val="ListParagraph"/>
         <w:rPr>
           <w:rFonts w:ascii="Arial" w:hAnsi="Arial" w:cs="Arial"/>
-        </w:rPr>
-      </w:pPr>
-      <w:r>
-        <w:rPr>
-          <w:rFonts w:ascii="Arial" w:hAnsi="Arial" w:cs="Arial"/>
+          <w:color w:val="70AD47" w:themeColor="accent6"/>
+        </w:rPr>
+      </w:pPr>
+      <w:r>
+        <w:rPr>
+          <w:rFonts w:ascii="Arial" w:hAnsi="Arial" w:cs="Arial"/>
+          <w:color w:val="70AD47" w:themeColor="accent6"/>
         </w:rPr>
         <w:t>Out: THIS</w:t>
       </w:r>
@@ -126,11 +137,13 @@
         <w:pStyle w:val="ListParagraph"/>
         <w:rPr>
           <w:rFonts w:ascii="Arial" w:hAnsi="Arial" w:cs="Arial"/>
-        </w:rPr>
-      </w:pPr>
-      <w:r>
-        <w:rPr>
-          <w:rFonts w:ascii="Arial" w:hAnsi="Arial" w:cs="Arial"/>
+          <w:color w:val="70AD47" w:themeColor="accent6"/>
+        </w:rPr>
+      </w:pPr>
+      <w:r>
+        <w:rPr>
+          <w:rFonts w:ascii="Arial" w:hAnsi="Arial" w:cs="Arial"/>
+          <w:color w:val="70AD47" w:themeColor="accent6"/>
         </w:rPr>
         <w:t>A</w:t>
       </w:r>
@@ -140,11 +153,13 @@
         <w:pStyle w:val="ListParagraph"/>
         <w:rPr>
           <w:rFonts w:ascii="Arial" w:hAnsi="Arial" w:cs="Arial"/>
-        </w:rPr>
-      </w:pPr>
-      <w:r>
-        <w:rPr>
-          <w:rFonts w:ascii="Arial" w:hAnsi="Arial" w:cs="Arial"/>
+          <w:color w:val="70AD47" w:themeColor="accent6"/>
+        </w:rPr>
+      </w:pPr>
+      <w:r>
+        <w:rPr>
+          <w:rFonts w:ascii="Arial" w:hAnsi="Arial" w:cs="Arial"/>
+          <w:color w:val="70AD47" w:themeColor="accent6"/>
         </w:rPr>
         <w:t>STRAGE</w:t>
       </w:r>
@@ -158,11 +173,13 @@
         </w:numPr>
         <w:rPr>
           <w:rFonts w:ascii="Arial" w:hAnsi="Arial" w:cs="Arial"/>
-        </w:rPr>
-      </w:pPr>
-      <w:r>
-        <w:rPr>
-          <w:rFonts w:ascii="Arial" w:hAnsi="Arial" w:cs="Arial"/>
+          <w:color w:val="70AD47" w:themeColor="accent6"/>
+        </w:rPr>
+      </w:pPr>
+      <w:r>
+        <w:rPr>
+          <w:rFonts w:ascii="Arial" w:hAnsi="Arial" w:cs="Arial"/>
+          <w:color w:val="70AD47" w:themeColor="accent6"/>
         </w:rPr>
         <w:t>Writing method sort list of Employees in the descending order by salary using LINQ. Note: reuse previous OOP exercises</w:t>
       </w:r>
@@ -176,11 +193,13 @@
         </w:numPr>
         <w:rPr>
           <w:rFonts w:ascii="Arial" w:hAnsi="Arial" w:cs="Arial"/>
-        </w:rPr>
-      </w:pPr>
-      <w:r>
-        <w:rPr>
-          <w:rFonts w:ascii="Arial" w:hAnsi="Arial" w:cs="Arial"/>
+          <w:color w:val="70AD47" w:themeColor="accent6"/>
+        </w:rPr>
+      </w:pPr>
+      <w:r>
+        <w:rPr>
+          <w:rFonts w:ascii="Arial" w:hAnsi="Arial" w:cs="Arial"/>
+          <w:color w:val="70AD47" w:themeColor="accent6"/>
         </w:rPr>
         <w:t>Writing method find largest salary in list of Employees using LINQ. Note: reuse previous OOP exercises</w:t>
       </w:r>
@@ -194,11 +213,13 @@
         </w:numPr>
         <w:rPr>
           <w:rFonts w:ascii="Arial" w:hAnsi="Arial" w:cs="Arial"/>
-        </w:rPr>
-      </w:pPr>
-      <w:r>
-        <w:rPr>
-          <w:rFonts w:ascii="Arial" w:hAnsi="Arial" w:cs="Arial"/>
+          <w:color w:val="70AD47" w:themeColor="accent6"/>
+        </w:rPr>
+      </w:pPr>
+      <w:r>
+        <w:rPr>
+          <w:rFonts w:ascii="Arial" w:hAnsi="Arial" w:cs="Arial"/>
+          <w:color w:val="70AD47" w:themeColor="accent6"/>
         </w:rPr>
         <w:t>Writing method find avgage salary in list of Employees using LINQ. Note: reuse previous OOP exercises</w:t>
       </w:r>
@@ -322,8 +343,6 @@
         </w:rPr>
         <w:t>Note: Only create a solution and each exercise corresponding to each project in solution.</w:t>
       </w:r>
-      <w:bookmarkStart w:id="0" w:name="_GoBack"/>
-      <w:bookmarkEnd w:id="0"/>
     </w:p>
     <w:sectPr>
       <w:pgSz w:w="12240" w:h="15840"/>
@@ -336,7 +355,7 @@
 </file>
 
 <file path=word/numbering.xml><?xml version="1.0" encoding="utf-8"?>
-<w:numbering xmlns:wpc="http://schemas.microsoft.com/office/word/2010/wordprocessingCanvas" xmlns:cx="http://schemas.microsoft.com/office/drawing/2014/chartex" xmlns:mc="http://schemas.openxmlformats.org/markup-compatibility/2006" xmlns:o="urn:schemas-microsoft-com:office:office" xmlns:r="http://schemas.openxmlformats.org/officeDocument/2006/relationships" xmlns:m="http://schemas.openxmlformats.org/officeDocument/2006/math" xmlns:v="urn:schemas-microsoft-com:vml" xmlns:wp14="http://schemas.microsoft.com/office/word/2010/wordprocessingDrawing" xmlns:wp="http://schemas.openxmlformats.org/drawingml/2006/wordprocessingDrawing" xmlns:w10="urn:schemas-microsoft-com:office:word" xmlns:w="http://schemas.openxmlformats.org/wordprocessingml/2006/main" xmlns:w14="http://schemas.microsoft.com/office/word/2010/wordml" xmlns:w15="http://schemas.microsoft.com/office/word/2012/wordml" xmlns:w16se="http://schemas.microsoft.com/office/word/2015/wordml/symex" xmlns:wpg="http://schemas.microsoft.com/office/word/2010/wordprocessingGroup" xmlns:wpi="http://schemas.microsoft.com/office/word/2010/wordprocessingInk" xmlns:wne="http://schemas.microsoft.com/office/word/2006/wordml" xmlns:wps="http://schemas.microsoft.com/office/word/2010/wordprocessingShape" mc:Ignorable="w14 w15 w16se wp14">
+<w:numbering xmlns:wpc="http://schemas.microsoft.com/office/word/2010/wordprocessingCanvas" xmlns:cx="http://schemas.microsoft.com/office/drawing/2014/chartex" xmlns:cx1="http://schemas.microsoft.com/office/drawing/2015/9/8/chartex" xmlns:cx2="http://schemas.microsoft.com/office/drawing/2015/10/21/chartex" xmlns:cx3="http://schemas.microsoft.com/office/drawing/2016/5/9/chartex" xmlns:cx4="http://schemas.microsoft.com/office/drawing/2016/5/10/chartex" xmlns:cx5="http://schemas.microsoft.com/office/drawing/2016/5/11/chartex" xmlns:cx6="http://schemas.microsoft.com/office/drawing/2016/5/12/chartex" xmlns:cx7="http://schemas.microsoft.com/office/drawing/2016/5/13/chartex" xmlns:cx8="http://schemas.microsoft.com/office/drawing/2016/5/14/chartex" xmlns:mc="http://schemas.openxmlformats.org/markup-compatibility/2006" xmlns:aink="http://schemas.microsoft.com/office/drawing/2016/ink" xmlns:am3d="http://schemas.microsoft.com/office/drawing/2017/model3d" xmlns:o="urn:schemas-microsoft-com:office:office" xmlns:oel="http://schemas.microsoft.com/office/2019/extlst" xmlns:r="http://schemas.openxmlformats.org/officeDocument/2006/relationships" xmlns:m="http://schemas.openxmlformats.org/officeDocument/2006/math" xmlns:v="urn:schemas-microsoft-com:vml" xmlns:wp14="http://schemas.microsoft.com/office/word/2010/wordprocessingDrawing" xmlns:wp="http://schemas.openxmlformats.org/drawingml/2006/wordprocessingDrawing" xmlns:w10="urn:schemas-microsoft-com:office:word" xmlns:w="http://schemas.openxmlformats.org/wordprocessingml/2006/main" xmlns:w14="http://schemas.microsoft.com/office/word/2010/wordml" xmlns:w15="http://schemas.microsoft.com/office/word/2012/wordml" xmlns:w16cex="http://schemas.microsoft.com/office/word/2018/wordml/cex" xmlns:w16cid="http://schemas.microsoft.com/office/word/2016/wordml/cid" xmlns:w16="http://schemas.microsoft.com/office/word/2018/wordml" xmlns:w16du="http://schemas.microsoft.com/office/word/2023/wordml/word16du" xmlns:w16sdtdh="http://schemas.microsoft.com/office/word/2020/wordml/sdtdatahash" xmlns:w16sdtfl="http://schemas.microsoft.com/office/word/2024/wordml/sdtformatlock" xmlns:w16se="http://schemas.microsoft.com/office/word/2015/wordml/symex" xmlns:wpg="http://schemas.microsoft.com/office/word/2010/wordprocessingGroup" xmlns:wpi="http://schemas.microsoft.com/office/word/2010/wordprocessingInk" xmlns:wne="http://schemas.microsoft.com/office/word/2006/wordml" xmlns:wps="http://schemas.microsoft.com/office/word/2010/wordprocessingShape" mc:Ignorable="w14 w15 w16se w16cid w16 w16cex w16sdtdh w16sdtfl w16du wp14">
   <w:abstractNum w:abstractNumId="0" w15:restartNumberingAfterBreak="0">
     <w:nsid w:val="1B555465"/>
     <w:multiLevelType w:val="hybridMultilevel"/>
@@ -940,29 +959,29 @@
       </w:rPr>
     </w:lvl>
   </w:abstractNum>
-  <w:num w:numId="1">
+  <w:num w:numId="1" w16cid:durableId="242378682">
     <w:abstractNumId w:val="4"/>
   </w:num>
-  <w:num w:numId="2">
+  <w:num w:numId="2" w16cid:durableId="1191069204">
     <w:abstractNumId w:val="3"/>
   </w:num>
-  <w:num w:numId="3">
+  <w:num w:numId="3" w16cid:durableId="1490094862">
     <w:abstractNumId w:val="5"/>
   </w:num>
-  <w:num w:numId="4">
+  <w:num w:numId="4" w16cid:durableId="988945352">
     <w:abstractNumId w:val="2"/>
   </w:num>
-  <w:num w:numId="5">
+  <w:num w:numId="5" w16cid:durableId="1382679795">
     <w:abstractNumId w:val="1"/>
   </w:num>
-  <w:num w:numId="6">
+  <w:num w:numId="6" w16cid:durableId="49888857">
     <w:abstractNumId w:val="0"/>
   </w:num>
 </w:numbering>
 </file>
 
 <file path=word/styles.xml><?xml version="1.0" encoding="utf-8"?>
-<w:styles xmlns:mc="http://schemas.openxmlformats.org/markup-compatibility/2006" xmlns:r="http://schemas.openxmlformats.org/officeDocument/2006/relationships" xmlns:w="http://schemas.openxmlformats.org/wordprocessingml/2006/main" xmlns:w14="http://schemas.microsoft.com/office/word/2010/wordml" xmlns:w15="http://schemas.microsoft.com/office/word/2012/wordml" xmlns:w16se="http://schemas.microsoft.com/office/word/2015/wordml/symex" mc:Ignorable="w14 w15 w16se">
+<w:styles xmlns:mc="http://schemas.openxmlformats.org/markup-compatibility/2006" xmlns:r="http://schemas.openxmlformats.org/officeDocument/2006/relationships" xmlns:w="http://schemas.openxmlformats.org/wordprocessingml/2006/main" xmlns:w14="http://schemas.microsoft.com/office/word/2010/wordml" xmlns:w15="http://schemas.microsoft.com/office/word/2012/wordml" xmlns:w16cex="http://schemas.microsoft.com/office/word/2018/wordml/cex" xmlns:w16cid="http://schemas.microsoft.com/office/word/2016/wordml/cid" xmlns:w16="http://schemas.microsoft.com/office/word/2018/wordml" xmlns:w16du="http://schemas.microsoft.com/office/word/2023/wordml/word16du" xmlns:w16sdtdh="http://schemas.microsoft.com/office/word/2020/wordml/sdtdatahash" xmlns:w16sdtfl="http://schemas.microsoft.com/office/word/2024/wordml/sdtformatlock" xmlns:w16se="http://schemas.microsoft.com/office/word/2015/wordml/symex" mc:Ignorable="w14 w15 w16se w16cid w16 w16cex w16sdtdh w16sdtfl w16du">
   <w:docDefaults>
     <w:rPrDefault>
       <w:rPr>
@@ -978,7 +997,7 @@
       </w:pPr>
     </w:pPrDefault>
   </w:docDefaults>
-  <w:latentStyles w:defLockedState="0" w:defUIPriority="99" w:defSemiHidden="0" w:defUnhideWhenUsed="0" w:defQFormat="0" w:count="371">
+  <w:latentStyles w:defLockedState="0" w:defUIPriority="99" w:defSemiHidden="0" w:defUnhideWhenUsed="0" w:defQFormat="0" w:count="376">
     <w:lsdException w:name="Normal" w:uiPriority="0" w:qFormat="1"/>
     <w:lsdException w:name="heading 1" w:uiPriority="9" w:qFormat="1"/>
     <w:lsdException w:name="heading 2" w:semiHidden="1" w:uiPriority="9" w:unhideWhenUsed="1" w:qFormat="1"/>
@@ -1350,6 +1369,11 @@
     <w:lsdException w:name="List Table 5 Dark Accent 6" w:uiPriority="50"/>
     <w:lsdException w:name="List Table 6 Colorful Accent 6" w:uiPriority="51"/>
     <w:lsdException w:name="List Table 7 Colorful Accent 6" w:uiPriority="52"/>
+    <w:lsdException w:name="Mention" w:semiHidden="1" w:unhideWhenUsed="1"/>
+    <w:lsdException w:name="Smart Hyperlink" w:semiHidden="1" w:unhideWhenUsed="1"/>
+    <w:lsdException w:name="Hashtag" w:semiHidden="1" w:unhideWhenUsed="1"/>
+    <w:lsdException w:name="Unresolved Mention" w:semiHidden="1" w:unhideWhenUsed="1"/>
+    <w:lsdException w:name="Smart Link" w:semiHidden="1" w:unhideWhenUsed="1"/>
   </w:latentStyles>
   <w:style w:type="paragraph" w:default="1" w:styleId="Normal">
     <w:name w:val="Normal"/>

</xml_diff>